<commit_message>
125M packs only: show the other project's finances and the combined cash position (deck slide, memo section 11.2, annex sheet); update QA and internal Q&A
Co-Authored-By: Claude Sonnet 5.5 <noreply@anthropic.com>
Claude-Session: https://claude.ai/code/session_01Tace5U23AKexiDyfCZxMPM
</commit_message>
<xml_diff>
--- a/output/GS_125M/DD_Memo.docx
+++ b/output/GS_125M/DD_Memo.docx
@@ -6902,6 +6902,22 @@
           <w:i w:val="0"/>
         </w:rPr>
         <w:t xml:space="preserve"> are reported from third-party summaries and asking prices; they are not audited.</w:t>
+      </w:r>
+    </w:p>
+    <w:p>
+      <w:r>
+        <w:rPr>
+          <w:b/>
+          <w:i w:val="0"/>
+        </w:rPr>
+        <w:t>Sponsor capacity (additional).</w:t>
+      </w:r>
+      <w:r>
+        <w:rPr>
+          <w:b w:val="0"/>
+          <w:i w:val="0"/>
+        </w:rPr>
+        <w:t xml:space="preserve"> Jalour's funding undertaking draws on its cash reserves and on other projects' cash. The combined view of Green Square and L'avenir (Investment Memorandum, section 11.2) shows a base-case combined low of EGP 168.0 million in month 15, but in the downside case both projects are short at the same time and the combined peak shortage is EGP 1,089 million.</w:t>
       </w:r>
     </w:p>
     <w:p>

</xml_diff>